<commit_message>
Prepare RRCP submission package and incorporate author approval
</commit_message>
<xml_diff>
--- a/revision/deliverables/Author_confirmations.docx
+++ b/revision/deliverables/Author_confirmations.docx
@@ -7,52 +7,22 @@
         <w:pStyle w:val="Title"/>
       </w:pPr>
       <w:r>
-        <w:t>Confirmaciones concretas antes de enviar a una revista</w:t>
+        <w:t>Registro de aprobación y datos de autoría para RRCP</w:t>
       </w:r>
     </w:p>
     <w:p>
       <w:r>
-        <w:t>La entrega científica y editorial está preparada para revisión de ambos autores. La rama revision/amaury-review está publicada en GitHub. No se ha enviado correo ni presentado el artículo.</w:t>
+        <w:t>El 11 de octubre de 2026, el autor de correspondencia confirmó en esta conversación que los datos ya estaban disponibles y que todo estaba aprobado. Se incorporan la aprobación de ambos autores, las contribuciones existentes, la ausencia de financiación y la ausencia de conflictos declaradas en el PDF de referencia. No se ha enviado correo ni presentado el artículo.</w:t>
       </w:r>
     </w:p>
     <w:p>
-      <w:pPr>
-        <w:pStyle w:val="ListBullet"/>
-      </w:pPr>
       <w:r>
-        <w:t>Financiación: ambos autores deben confirmar la declaración del PDF: “No funding was received for this study”, incluyendo recursos o apoyo institucional que deban declararse.</w:t>
+        <w:t>Francisco Federico García Crespi, PhD, Department of Computer Engineering, Universidad Miguel Hernández, Elche, Alicante, Spain. ORCID 0000-0002-7129-7791; fedeg@umh.es. Correspondencia en edificio Alcudia, despacho E14P1017, Avenida de la Universidad, s/n, 03202 Elche, Alicante, Spain. Teléfono institucional de centralita +34 96 665 8500, no presentado como teléfono directo.</w:t>
       </w:r>
     </w:p>
     <w:p>
-      <w:pPr>
-        <w:pStyle w:val="ListBullet"/>
-      </w:pPr>
       <w:r>
-        <w:t>Conflictos: cada autor debe confirmar la declaración de ausencia de conflictos y completar el formulario requerido por la revista finalmente elegida.</w:t>
-      </w:r>
-    </w:p>
-    <w:p>
-      <w:pPr>
-        <w:pStyle w:val="ListBullet"/>
-      </w:pPr>
-      <w:r>
-        <w:t>Ética: acreditar con orientación institucional/journal la aplicabilidad de la vía correspondiente a esta reutilización de SIM público. No existe en el paquete una exención formal concedida. Si hay documento, incorporar entidad, número y fecha; si no, acordar una formulación exacta aceptada por institución y revista.</w:t>
-      </w:r>
-    </w:p>
-    <w:p>
-      <w:pPr>
-        <w:pStyle w:val="ListBullet"/>
-      </w:pPr>
-      <w:r>
-        <w:t>Autoría: confirmar orden, afiliaciones, dirección postal del autor de correspondencia, ORCID y contribuciones CRediT reales. Los datos actuales se conservan del PDF enviado; no acreditan nuevas verificaciones.</w:t>
-      </w:r>
-    </w:p>
-    <w:p>
-      <w:pPr>
-        <w:pStyle w:val="ListBullet"/>
-      </w:pPr>
-      <w:r>
-        <w:t>Revisión humana y herramientas: ambos autores deben revisar métodos, salidas, interpretaciones y el texto preparado con Codex; confirmar la descripción de otras herramientas usadas y la responsabilidad autoral. No se ha afirmado que esa revisión conjunta ya esté completada.</w:t>
+        <w:t>Amaury de Souza, PhD in Environmental Technologies, Institute of Physics, Federal University of Mato Grosso do Sul, Campo Grande, MS, Brazil. ORCID 0000-0001-8168-1482; amaury.souza@ufms.br.</w:t>
       </w:r>
     </w:p>
     <w:p>
@@ -60,27 +30,35 @@
         <w:pStyle w:val="Heading1"/>
       </w:pPr>
       <w:r>
-        <w:t>Consulta ética documental realizada el 11 de octubre de 2026</w:t>
+        <w:t>Procedencia de los datos recuperados</w:t>
       </w:r>
     </w:p>
     <w:p>
       <w:r>
-        <w:t>Las instrucciones oficiales de JBP exigen declaración de aprobación ética en Methods para estudios humanos/animales y formulario de conflictos de todos los autores: https://www.jornaldepneumologia.com.br/journal/9 y https://www.jornaldepneumologia.com.br/journal/8. Esas instrucciones generales no acreditan una exención para este trabajo concreto.</w:t>
+        <w:t>El ORCID, correo y departamento de García Crespi aparecen en su artículo publicado https://onlinelibrary.wiley.com/doi/full/10.1002/cae.70196 . El despacho figura en https://fedeg.umh.es/bio/localizacion/ . Dirección postal y centralita constan en la web oficial UMH https://www.umh.es/contenido/Universidad/:persona_112561/datos_es.html . El doctorado consta en https://dspace.umh.es/bitstream/11000/2644/1/TD%20Garc%C3%ADa%20Cresp%C3%AD%2C%20Federico.pdf .</w:t>
       </w:r>
     </w:p>
     <w:p>
       <w:r>
-        <w:t>La guía primaria CNS/Conep sobre uso de datos distingue acceso público, anonimización y dominio público; no equipara automáticamente disponibilidad en Internet con ausencia de obligaciones: https://www.gov.br/conselho-nacional-de-saude/pt-br/acesso-a-informacao/camaras-tecnicas-e-comissoes-backup/conep/cep/educa-ceps/modulo-uso-de-dados-em-pesquisas-cientificas-acesso-compartilhamento-e-protecao . No se utiliza la Resolución 510/2016 como exención universal para una reanálisis epidemiológico.</w:t>
+        <w:t>Los datos de Amaury constan en el PDF enviado, su perfil https://orcid.org/0000-0001-8168-1482 y el artículo https://www.periodicos.ufsm.br/cienciaenatura/article/download/87369/65163 . Las contribuciones se recuperan del manuscrito previo y quedan confirmadas con la respuesta del autor de correspondencia.</w:t>
+      </w:r>
+    </w:p>
+    <w:p>
+      <w:pPr>
+        <w:pStyle w:val="Heading1"/>
+      </w:pPr>
+      <w:r>
+        <w:t>Único pendiente documental identificado</w:t>
       </w:r>
     </w:p>
     <w:p>
       <w:r>
-        <w:t>La orientación institucional UFMS prevé evaluar la necesidad de remisión a comités de ética: https://inisa.ufms.br/comissao-setorial-de-pesquisa/ . La determinación aplicable a los autores y a la revista sigue requiriendo acreditación específica. No se ha contactado con ninguna institución ni editor.</w:t>
+        <w:t>No se ha localizado un documento de aprobación o exención ética formal con entidad, número y fecha. La aprobación autoral no se convierte en una aprobación institucional. El manuscrito y la carta describen el uso de SIM público, denominadores agregados y ausencia de contacto con participantes, sin afirmar una exención concedida. Si el portal exige un identificador o documento institucional, deberá acreditarse esa determinación antes de completar el envío. Las preguntas de exclusividad y difusión previa se contestarán por el autor que efectúe el envío.</w:t>
       </w:r>
     </w:p>
     <w:p>
       <w:r>
-        <w:t>No se ha verificado aquí el supuesto cambio de nombre de la revista a Respiratory Research &amp; Clinical Practice ni sus tasas; no se presenta esa sugerencia del correo como decisión editorial o comprobación vigente. La selección de revista está pendiente de los autores.</w:t>
+        <w:t>Instrucciones de la revista https://rrcpjournal.org/instructions-for-authors/ .</w:t>
       </w:r>
     </w:p>
     <w:sectPr>

</xml_diff>

<commit_message>
Finalize public-records ethics wording and submission package
</commit_message>
<xml_diff>
--- a/revision/deliverables/Author_confirmations.docx
+++ b/revision/deliverables/Author_confirmations.docx
@@ -48,12 +48,12 @@
         <w:pStyle w:val="Heading1"/>
       </w:pPr>
       <w:r>
-        <w:t>Único pendiente documental identificado</w:t>
+        <w:t>Declaración ética</w:t>
       </w:r>
     </w:p>
     <w:p>
       <w:r>
-        <w:t>El autor ha indicado que se use la misma declaración de ética del manuscrito original. Se ha recuperado e incorporado literalmente en Métodos, portada y carta: “The study used publicly accessible SIM mortality data and aggregated population projections without direct contact with participants. No identifying personal information was included in the reported results.” No se ha localizado un documento de aprobación o exención ética formal con entidad, número y fecha. La aprobación autoral no se convierte en una aprobación institucional, ni la declaración histórica acredita una exención concedida. Si el portal exige un identificador o documento institucional, deberá acreditarse esa determinación antes de completar el envío. Las preguntas de exclusividad y difusión previa se contestarán por el autor que efectúe el envío.</w:t>
+        <w:t>El autor confirma que se trata de un análisis ecológico de registros públicos, sin estudio con participantes humanos, y pide usar la declaración de ética del manuscrito original. Se ha recuperado e incorporado literalmente en Métodos, portada y carta: “The study used publicly accessible SIM mortality data and aggregated population projections without direct contact with participants. No identifying personal information was included in the reported results.” No se comunica un número de aprobación de un comité, porque no consta una resolución formal. La declaración factual queda cerrada para el paquete editorial. Las preguntas de exclusividad y difusión previa se contestarán por el autor que efectúe el envío.</w:t>
       </w:r>
     </w:p>
     <w:p>

</xml_diff>